<commit_message>
Refactor footer menu to support burger menu layout
</commit_message>
<xml_diff>
--- a/Website Erforderungen.docx
+++ b/Website Erforderungen.docx
@@ -40,7 +40,15 @@
         <w:t xml:space="preserve"> </w:t>
       </w:r>
       <w:r>
-        <w:t>Zum Beispiel muss die geschützte, systemweite hosts-Datei verändert werden</w:t>
+        <w:t xml:space="preserve">Zum Beispiel muss die geschützte, systemweite </w:t>
+      </w:r>
+      <w:proofErr w:type="spellStart"/>
+      <w:r>
+        <w:t>hosts</w:t>
+      </w:r>
+      <w:proofErr w:type="spellEnd"/>
+      <w:r>
+        <w:t>-Datei verändert werden</w:t>
       </w:r>
     </w:p>
     <w:p>
@@ -128,6 +136,77 @@
         <w:t>Hier ist die vollständige **Übersetzung der vorgeschlagenen Website-Struktur ins Deutsche**. Ich habe die Bezeichnungen so gewählt, wie sie in deutschen Sozialkaufhäusern und gemeinnützigen Organisationen üblich sind (natürlich, freundlich, klar und barrierefrei orientiert).</w:t>
       </w:r>
     </w:p>
+    <w:p>
+      <w:r>
+        <w:t xml:space="preserve">4. Domain Name ist </w:t>
+      </w:r>
+      <w:r>
+        <w:rPr>
+          <w:b/>
+          <w:bCs/>
+        </w:rPr>
+        <w:t>barmbini.de</w:t>
+      </w:r>
+      <w:r>
+        <w:t xml:space="preserve">. </w:t>
+      </w:r>
+      <w:r>
+        <w:t xml:space="preserve">Wenn Sie die Domain </w:t>
+      </w:r>
+      <w:r>
+        <w:rPr>
+          <w:b/>
+          <w:bCs/>
+        </w:rPr>
+        <w:t>barmbini.de</w:t>
+      </w:r>
+      <w:r>
+        <w:t xml:space="preserve"> wählen, sieht die E-Mail-Adresse so aus: </w:t>
+      </w:r>
+      <w:hyperlink r:id="rId6" w:tgtFrame="_blank" w:history="1">
+        <w:r>
+          <w:rPr>
+            <w:rStyle w:val="Hyperlink"/>
+          </w:rPr>
+          <w:t>name@barmbini.de</w:t>
+        </w:r>
+      </w:hyperlink>
+      <w:r>
+        <w:t>; bei IONOS legen Sie den Teil vor dem @ selbst fest und wählen die Domain aus Ihrem Tarif.</w:t>
+      </w:r>
+    </w:p>
+    <w:p>
+      <w:r>
+        <w:t>Für WordPress Hosting bei IONOS sind Domain, E-Mail und SSL enthalten, und in den Tarifen ist mindestens ein Postfach dabei; in teureren Paketen sind mehr Adressen verfügbar.</w:t>
+      </w:r>
+    </w:p>
+    <w:p>
+      <w:r>
+        <w:t xml:space="preserve">Zum Beispiel können Sie </w:t>
+      </w:r>
+      <w:hyperlink r:id="rId7" w:tgtFrame="_blank" w:history="1">
+        <w:r>
+          <w:rPr>
+            <w:rStyle w:val="Hyperlink"/>
+          </w:rPr>
+          <w:t>info@barmbini.de</w:t>
+        </w:r>
+      </w:hyperlink>
+      <w:r>
+        <w:t xml:space="preserve"> oder </w:t>
+      </w:r>
+      <w:hyperlink r:id="rId8" w:tgtFrame="_blank" w:history="1">
+        <w:r>
+          <w:rPr>
+            <w:rStyle w:val="Hyperlink"/>
+          </w:rPr>
+          <w:t>kontakt@barmbini.de</w:t>
+        </w:r>
+      </w:hyperlink>
+      <w:r>
+        <w:t xml:space="preserve"> einrichten, sofern diese lokale Adresse in Ihrem Tarif noch frei ist.</w:t>
+      </w:r>
+    </w:p>
     <w:p/>
     <w:p>
       <w:pPr>
@@ -299,7 +378,15 @@
         <w:ind w:left="714" w:hanging="357"/>
       </w:pPr>
       <w:r>
-        <w:t xml:space="preserve"> großer Hero-Bereich mit Foto vom Laden oder Ware + Slogan  z. B. „Günstige Kleidung &amp; Spielzeug für Familien in Not“</w:t>
+        <w:t xml:space="preserve"> großer Hero-Bereich mit Foto vom Laden oder Ware + </w:t>
+      </w:r>
+      <w:proofErr w:type="gramStart"/>
+      <w:r>
+        <w:t>Slogan  z.</w:t>
+      </w:r>
+      <w:proofErr w:type="gramEnd"/>
+      <w:r>
+        <w:t xml:space="preserve"> B. „Günstige Kleidung &amp; Spielzeug für Familien in Not“</w:t>
       </w:r>
     </w:p>
     <w:p>
@@ -355,7 +442,15 @@
         <w:ind w:left="714" w:hanging="357"/>
       </w:pPr>
       <w:r>
-        <w:t>Call-to-Action: „Kommen Sie vorbei!“ mit Adresse + kleiner Karte</w:t>
+        <w:t>Call-</w:t>
+      </w:r>
+      <w:proofErr w:type="spellStart"/>
+      <w:r>
+        <w:t>to</w:t>
+      </w:r>
+      <w:proofErr w:type="spellEnd"/>
+      <w:r>
+        <w:t>-Action: „Kommen Sie vorbei!“ mit Adresse + kleiner Karte</w:t>
       </w:r>
     </w:p>
     <w:p>
@@ -936,7 +1031,15 @@
         <w:ind w:left="1276"/>
       </w:pPr>
       <w:r>
-        <w:t>Telefon, E-Mail, ggf. Social-Media-Links (Facebook/Instagram)</w:t>
+        <w:t xml:space="preserve">Telefon, E-Mail, ggf. </w:t>
+      </w:r>
+      <w:proofErr w:type="spellStart"/>
+      <w:r>
+        <w:t>Social</w:t>
+      </w:r>
+      <w:proofErr w:type="spellEnd"/>
+      <w:r>
+        <w:t>-Media-Links (Facebook/Instagram)</w:t>
       </w:r>
     </w:p>
     <w:p>
@@ -1291,7 +1394,7 @@
       <w:r>
         <w:t xml:space="preserve">Login: </w:t>
       </w:r>
-      <w:hyperlink r:id="rId6" w:history="1">
+      <w:hyperlink r:id="rId9" w:history="1">
         <w:r>
           <w:rPr>
             <w:rStyle w:val="Hyperlink"/>
@@ -1300,24 +1403,26 @@
         </w:r>
       </w:hyperlink>
       <w:r>
-        <w:t xml:space="preserve"> oder barmbini</w:t>
-      </w:r>
+        <w:t xml:space="preserve"> oder </w:t>
+      </w:r>
+      <w:proofErr w:type="spellStart"/>
+      <w:r>
+        <w:t>barmbini</w:t>
+      </w:r>
+      <w:proofErr w:type="spellEnd"/>
       <w:r>
         <w:br/>
         <w:t>Passwort:</w:t>
       </w:r>
       <w:r>
-        <w:t xml:space="preserve"> </w:t>
-      </w:r>
-      <w:r>
-        <w:t>#Barmbini26Admin</w:t>
+        <w:t xml:space="preserve"> #Barmbini26Admin</w:t>
       </w:r>
     </w:p>
     <w:p>
       <w:r>
         <w:t xml:space="preserve">Login: </w:t>
       </w:r>
-      <w:hyperlink r:id="rId7" w:history="1">
+      <w:hyperlink r:id="rId10" w:history="1">
         <w:r>
           <w:rPr>
             <w:rStyle w:val="Hyperlink"/>
@@ -1331,9 +1436,11 @@
       <w:r>
         <w:t xml:space="preserve">oder </w:t>
       </w:r>
+      <w:proofErr w:type="spellStart"/>
       <w:r>
         <w:t>Redaktuer</w:t>
       </w:r>
+      <w:proofErr w:type="spellEnd"/>
       <w:r>
         <w:br/>
         <w:t xml:space="preserve">Passwort: </w:t>
@@ -5553,7 +5660,6 @@
   <w:style w:type="character" w:default="1" w:styleId="Absatz-Standardschriftart">
     <w:name w:val="Default Paragraph Font"/>
     <w:uiPriority w:val="1"/>
-    <w:semiHidden/>
     <w:unhideWhenUsed/>
   </w:style>
   <w:style w:type="table" w:default="1" w:styleId="NormaleTabelle">
@@ -5960,6 +6066,18 @@
       <w:rFonts w:ascii="Times New Roman" w:hAnsi="Times New Roman" w:cs="Times New Roman"/>
     </w:rPr>
   </w:style>
+  <w:style w:type="character" w:styleId="BesuchterLink">
+    <w:name w:val="FollowedHyperlink"/>
+    <w:basedOn w:val="Absatz-Standardschriftart"/>
+    <w:uiPriority w:val="99"/>
+    <w:semiHidden/>
+    <w:unhideWhenUsed/>
+    <w:rsid w:val="001F27DB"/>
+    <w:rPr>
+      <w:color w:val="954F72" w:themeColor="followedHyperlink"/>
+      <w:u w:val="single"/>
+    </w:rPr>
+  </w:style>
 </w:styles>
 </file>
 

</xml_diff>